<commit_message>
fix(pre-build): invariant 17 builds workable-items from source every run and refuses when Go is absent, so a stale shipped binary can no longer be selected
Operator decision: build on demand. The old candidate loop preferred the git-tracked bin/workable-items, which on a fresh clone could predate its own source. New resolver scripts/pre_build/build_workable_items_from_source.sh builds fresh or exits 3; invariant 17 turns a refusal into a FAIL, never a SKIP. The env override is dropped. Test covers stale-binary fixture, source edit, Go absent, compile error, a negative control replaying the old loop, and a paired mutation.

Co-Authored-By: Claude Opus 5.5 <noreply@anthropic.com> [skip-ci]
</commit_message>
<xml_diff>
--- a/docs/scripts/check_cm_workable_items_binary_fresh.docx
+++ b/docs/scripts/check_cm_workable_items_binary_fresh.docx
@@ -2,7 +2,7 @@
 <file path=word/document.xml><?xml version="1.0" encoding="utf-8"?>
 <w:document xmlns:w="http://schemas.openxmlformats.org/wordprocessingml/2006/main" xmlns:m="http://schemas.openxmlformats.org/officeDocument/2006/math" xmlns:r="http://schemas.openxmlformats.org/officeDocument/2006/relationships" xmlns:o="urn:schemas-microsoft-com:office:office" xmlns:v="urn:schemas-microsoft-com:vml" xmlns:w10="urn:schemas-microsoft-com:office:word" xmlns:a="http://schemas.openxmlformats.org/drawingml/2006/main" xmlns:pic="http://schemas.openxmlformats.org/drawingml/2006/picture" xmlns:wp="http://schemas.openxmlformats.org/drawingml/2006/wordprocessingDrawing">
   <w:body>
-    <w:bookmarkStart w:id="20" w:name="check_cm_workable_items_binary_fresh.sh"/>
+    <w:bookmarkStart w:id="21" w:name="check_cm_workable_items_binary_fresh.sh"/>
     <w:p>
       <w:pPr>
         <w:pStyle w:val="Heading1"/>
@@ -26,7 +26,7 @@
         <w:t xml:space="preserve"> </w:t>
       </w:r>
       <w:r>
-        <w:t xml:space="preserve">1</w:t>
+        <w:t xml:space="preserve">2</w:t>
       </w:r>
       <w:r>
         <w:t xml:space="preserve"> </w:t>
@@ -42,7 +42,7 @@
         <w:t xml:space="preserve"> </w:t>
       </w:r>
       <w:r>
-        <w:t xml:space="preserve">2026-08-25T20:55:00Z</w:t>
+        <w:t xml:space="preserve">2026-09-26T13:05:00Z</w:t>
       </w:r>
     </w:p>
     <w:bookmarkStart w:id="9" w:name="overview"/>
@@ -109,7 +109,64 @@
       </w:r>
     </w:p>
     <w:bookmarkEnd w:id="9"/>
-    <w:bookmarkStart w:id="10" w:name="why-this-exists"/>
+    <w:bookmarkStart w:id="10" w:name="status-update-2026-09-26"/>
+    <w:p>
+      <w:pPr>
+        <w:pStyle w:val="Heading2"/>
+      </w:pPr>
+      <w:r>
+        <w:t xml:space="preserve">Status update (2026-09-26)</w:t>
+      </w:r>
+    </w:p>
+    <w:p>
+      <w:pPr>
+        <w:pStyle w:val="FirstParagraph"/>
+      </w:pPr>
+      <w:r>
+        <w:t xml:space="preserve">Invariant 17 no longer picks a binary from disk: it builds from source on every</w:t>
+      </w:r>
+      <w:r>
+        <w:t xml:space="preserve"> </w:t>
+      </w:r>
+      <w:r>
+        <w:t xml:space="preserve">run through</w:t>
+      </w:r>
+      <w:r>
+        <w:t xml:space="preserve"> </w:t>
+      </w:r>
+      <w:r>
+        <w:rPr>
+          <w:rStyle w:val="VerbatimChar"/>
+        </w:rPr>
+        <w:t xml:space="preserve">scripts/pre_build/build_workable_items_from_source.sh</w:t>
+      </w:r>
+      <w:r>
+        <w:t xml:space="preserve"> </w:t>
+      </w:r>
+      <w:r>
+        <w:t xml:space="preserve">(the BOB-188</w:t>
+      </w:r>
+      <w:r>
+        <w:t xml:space="preserve"> </w:t>
+      </w:r>
+      <w:r>
+        <w:t xml:space="preserve">operator decision, build on demand). The candidate loop described below is</w:t>
+      </w:r>
+      <w:r>
+        <w:t xml:space="preserve"> </w:t>
+      </w:r>
+      <w:r>
+        <w:t xml:space="preserve">history. This gate remains as defence-in-depth, because other callers still use</w:t>
+      </w:r>
+      <w:r>
+        <w:t xml:space="preserve"> </w:t>
+      </w:r>
+      <w:r>
+        <w:t xml:space="preserve">the shipped binary for as long as it exists.</w:t>
+      </w:r>
+    </w:p>
+    <w:bookmarkEnd w:id="10"/>
+    <w:bookmarkStart w:id="11" w:name="why-this-exists"/>
     <w:p>
       <w:pPr>
         <w:pStyle w:val="Heading2"/>
@@ -564,8 +621,8 @@
         <w:t xml:space="preserve">ten un-migrated terminal-status rows survived the gate meant to catch them.</w:t>
       </w:r>
     </w:p>
-    <w:bookmarkEnd w:id="10"/>
-    <w:bookmarkStart w:id="11" w:name="prerequisites"/>
+    <w:bookmarkEnd w:id="11"/>
+    <w:bookmarkStart w:id="12" w:name="prerequisites"/>
     <w:p>
       <w:pPr>
         <w:pStyle w:val="Heading2"/>
@@ -609,8 +666,8 @@
         <w:t xml:space="preserve">; built here with go1.26.2).</w:t>
       </w:r>
     </w:p>
-    <w:bookmarkEnd w:id="11"/>
-    <w:bookmarkStart w:id="12" w:name="usage"/>
+    <w:bookmarkEnd w:id="12"/>
+    <w:bookmarkStart w:id="13" w:name="usage"/>
     <w:p>
       <w:pPr>
         <w:pStyle w:val="Heading2"/>
@@ -644,8 +701,8 @@
         <w:t xml:space="preserve">Runs automatically as pre-build invariant 52.</w:t>
       </w:r>
     </w:p>
-    <w:bookmarkEnd w:id="12"/>
-    <w:bookmarkStart w:id="13" w:name="verdicts"/>
+    <w:bookmarkEnd w:id="13"/>
+    <w:bookmarkStart w:id="14" w:name="verdicts"/>
     <w:p>
       <w:pPr>
         <w:pStyle w:val="Heading2"/>
@@ -769,8 +826,8 @@
         </w:tc>
       </w:tr>
     </w:tbl>
-    <w:bookmarkEnd w:id="13"/>
-    <w:bookmarkStart w:id="14" w:name="remediation"/>
+    <w:bookmarkEnd w:id="14"/>
+    <w:bookmarkStart w:id="15" w:name="remediation"/>
     <w:p>
       <w:pPr>
         <w:pStyle w:val="Heading2"/>
@@ -1237,8 +1294,8 @@
         <w:t xml:space="preserve"> bin/.source.sha256</w:t>
       </w:r>
     </w:p>
-    <w:bookmarkEnd w:id="14"/>
-    <w:bookmarkStart w:id="15" w:name="internal-behaviour"/>
+    <w:bookmarkEnd w:id="15"/>
+    <w:bookmarkStart w:id="16" w:name="internal-behaviour"/>
     <w:p>
       <w:pPr>
         <w:pStyle w:val="Heading2"/>
@@ -1428,8 +1485,8 @@
         <w:t xml:space="preserve">of them is honest — so an empty scan FAILs as BLIND rather than passing.</w:t>
       </w:r>
     </w:p>
-    <w:bookmarkEnd w:id="15"/>
-    <w:bookmarkStart w:id="16" w:name="edge-cases"/>
+    <w:bookmarkEnd w:id="16"/>
+    <w:bookmarkStart w:id="17" w:name="edge-cases"/>
     <w:p>
       <w:pPr>
         <w:pStyle w:val="Heading2"/>
@@ -1510,8 +1567,8 @@
         <w:t xml:space="preserve">proven fresh is the precondition of BOB-188, not a lesser state of it.</w:t>
       </w:r>
     </w:p>
-    <w:bookmarkEnd w:id="16"/>
-    <w:bookmarkStart w:id="17" w:name="open-question-operator-owned-11.4.30"/>
+    <w:bookmarkEnd w:id="17"/>
+    <w:bookmarkStart w:id="18" w:name="open-question-operator-owned-11.4.30"/>
     <w:p>
       <w:pPr>
         <w:pStyle w:val="Heading2"/>
@@ -1581,8 +1638,8 @@
         <w:t xml:space="preserve">actively causing harm.</w:t>
       </w:r>
     </w:p>
-    <w:bookmarkEnd w:id="17"/>
-    <w:bookmarkStart w:id="18" w:name="related"/>
+    <w:bookmarkEnd w:id="18"/>
+    <w:bookmarkStart w:id="19" w:name="related"/>
     <w:p>
       <w:pPr>
         <w:pStyle w:val="Heading2"/>
@@ -1704,8 +1761,8 @@
         <w:t xml:space="preserve">mutations (3 golden-TRUE, 4 golden-FALSE).</w:t>
       </w:r>
     </w:p>
-    <w:bookmarkEnd w:id="18"/>
-    <w:bookmarkStart w:id="19" w:name="last-verified"/>
+    <w:bookmarkEnd w:id="19"/>
+    <w:bookmarkStart w:id="20" w:name="last-verified"/>
     <w:p>
       <w:pPr>
         <w:pStyle w:val="Heading2"/>
@@ -1728,8 +1785,8 @@
         <w:t xml:space="preserve">rebuild.</w:t>
       </w:r>
     </w:p>
-    <w:bookmarkEnd w:id="19"/>
     <w:bookmarkEnd w:id="20"/>
+    <w:bookmarkEnd w:id="21"/>
     <w:sectPr>
       <w:footnotePr>
         <w:numRestart w:val="eachSect"/>

</xml_diff>